<commit_message>
feat: premium dashboard and monitoring stabilization
</commit_message>
<xml_diff>
--- a/resumos/Oficina em Soluções Web - Matutino/196668_Scrum - Visualização Geral_Resumo_PRO.docx
+++ b/resumos/Oficina em Soluções Web - Matutino/196668_Scrum - Visualização Geral_Resumo_PRO.docx
@@ -15,7 +15,7 @@
         <w:rPr>
           <w:b/>
         </w:rPr>
-        <w:t>Disciplina: Oficina em Soluções Web - Matutino</w:t>
+        <w:t>Disciplina: OFICINA EM SOLUÇÕES WEB - MATUTINO</w:t>
       </w:r>
       <w:r>
         <w:br/>
@@ -32,7 +32,15 @@
     </w:p>
     <w:p>
       <w:r>
-        <w:t>Fundamentos do Empirismo (Transparência, Inspeção, Adaptação); Papéis do Scrum Team (Product Owner, Scrum Master, Developers); Eventos (Sprint, Planning, Daily, Review, Retrospective); Artefatos (Product Backlog, Sprint Backlog, Increment); Definição de Pronto (DoD) e Metas de Entrega.</w:t>
+        <w:t>• Anatomia do Scrum: Papéis (PO, SM, Dev Team), Artefatos e Eventos.</w:t>
+        <w:br/>
+        <w:t>• Ciclo de Vida do Sprint: Do Planejamento à Retrospectiva.</w:t>
+        <w:br/>
+        <w:t>• Gerenciamento de Backlog: Refinamento, Priorização e Sprint Backlog.</w:t>
+        <w:br/>
+        <w:t>• Visibilidade e Transparência: O uso do Quadro Kanban (To Do, Doing, Done) e o Incremento do Produto.</w:t>
+        <w:br/>
+        <w:t>• Feedback Loops: Daily Scrum, Sprint Review e o conceito de melhoria contínua.</w:t>
       </w:r>
     </w:p>
     <w:p>
@@ -50,7 +58,7 @@
     </w:p>
     <w:p>
       <w:r>
-        <w:t>O Scrum não nasceu no vácuo da engenharia de software; ele emergiu da necessidade de gerenciar o caos. Originado formalmente nos anos 90 por Jeff Sutherland e Ken Schwaber, suas raízes bebem da fonte do 'The New New Product Development Game' (1986), de Takeuchi e Nonaka, que observaram como empresas de alta performance (como Toyota e Honda) trabalhavam de forma holística, como um time de rúgbi. No cenário atual das Big Techs, o Scrum é o motor que permite a empresas como Amazon e Spotify iterarem em escala massiva. O mercado abandonou o modelo 'Waterfall' (Cascata) porque o custo do erro tardio é proibitivo. Nas Big Techs, o Scrum é adaptado para o modelo de 'Squads', onde a autonomia é equilibrada com o alinhamento estratégico, permitindo que o 'Time-to-Market' seja reduzido drasticamente.</w:t>
+        <w:t>O Scrum surge no final dos anos 80 e início dos 90, consolidado pelo 'Manifesto Ágil' em 2001, como uma resposta direta à falha catastrófica do modelo em 'Cascata' (Waterfall) no desenvolvimento de software complexo. Em Big Techs como Google, Amazon e Spotify, o Scrum não é apenas um método, mas uma filosofia operacional. Ele permite que essas organizações lidem com a volatilidade do mercado, entregando valor de forma incremental. O uso do Scrum permite que uma empresa pivote sua estratégia em questão de semanas (o tempo de um Sprint), em vez de meses ou anos, garantindo que o produto final ainda seja relevante para o usuário quando chegar ao mercado.</w:t>
       </w:r>
     </w:p>
     <w:p>
@@ -60,77 +68,72 @@
     </w:p>
     <w:p>
       <w:r>
-        <w:t>O Scrum é fundamentado no empirismo e no Lean Thinking. O empirismo afirma que o conhecimento vem da experiência e da tomada de decisão baseada no que é observado.</w:t>
+        <w:t>A visualização apresentada decompõe o ecossistema Scrum em três pilares fundamentais: Papéis, Eventos e Artefatos.</w:t>
       </w:r>
     </w:p>
     <w:p>
       <w:r>
-        <w:t>1. **Os Três Pilares:**</w:t>
+        <w:t>1. **Os Papéis (O Time Scrum):**</w:t>
       </w:r>
     </w:p>
     <w:p>
       <w:r>
-        <w:t>- **Transparência:** O processo e o trabalho devem ser visíveis tanto para quem executa quanto para quem recebe.</w:t>
+        <w:t>- **Product Owner (PO):** O guardião do 'O Quê'. Ele traduz as necessidades dos Stakeholders (representados no topo do diagrama com a lâmpada de ideias) em itens acionáveis no Product Backlog. O PO maximiza o ROI (Retorno sobre Investimento).</w:t>
       </w:r>
     </w:p>
     <w:p>
       <w:r>
-        <w:t>- **Inspeção:** Os artefatos e o progresso em direção aos objetivos devem ser inspecionados com frequência para detectar variações indesejadas.</w:t>
+        <w:t>- **Scrum Master (SM):** O líder servidor. Ele não gerencia pessoas, mas o processo. Sua função é remover impedimentos e garantir que o time entenda a teoria e a prática do Scrum.</w:t>
       </w:r>
     </w:p>
     <w:p>
       <w:r>
-        <w:t>- **Adaptação:** Se um processo se desvia dos limites aceitáveis, o ajuste deve ser feito o mais rápido possível.</w:t>
+        <w:t>- **Development Team (Time de Desenvolvimento):** Profissionais multifuncionais que transformam itens do backlog em um Incremento funcional. Notem que no diagrama eles são representados como um grupo coeso, enfatizando a ausência de hierarquias internas.</w:t>
       </w:r>
     </w:p>
     <w:p>
       <w:r>
-        <w:t>2. **Papéis (A Trindade de Responsabilidades):**</w:t>
+        <w:t>2. **Os Artefatos (Transparência):**</w:t>
       </w:r>
     </w:p>
     <w:p>
       <w:r>
-        <w:t>- **Product Owner (PO):** Otimizador de valor. Ele não é um 'anotador de pedidos', mas um estrategista que gerencia o Product Backlog para maximizar o ROI (Retorno sobre Investimento).</w:t>
+        <w:t>- **Product Backlog:** Uma lista ordenada de tudo o que pode ser necessário no produto. O diagrama mostra o 'Product Backlog Refinement' como um funil, indicando que as ideias brutas são filtradas e detalhadas.</w:t>
       </w:r>
     </w:p>
     <w:p>
       <w:r>
-        <w:t>- **Scrum Master (SM):** O líder servidor e coach. Sua função é remover impedimentos e garantir que o time compreenda a teoria e a prática do Scrum. Ele é o guardião do processo.</w:t>
+        <w:t>- **Sprint Backlog:** O subconjunto de itens selecionados para o Sprint atual. É visualizado através do quadro 'To Do, Doing, Done', que fornece visibilidade em tempo real sobre o progresso.</w:t>
       </w:r>
     </w:p>
     <w:p>
       <w:r>
-        <w:t>- **Developers:** Profissionais multidisciplinares que se comprometem a criar qualquer aspecto de um incremento utilizável a cada Sprint.</w:t>
+        <w:t>- **Product Increment:** A soma de todos os itens do backlog concluídos durante um Sprint que atingiram a 'Definição de Pronto' (DoD). Representado como um presente, simbolizando o valor entregue ao cliente.</w:t>
       </w:r>
     </w:p>
     <w:p>
       <w:r>
-        <w:t>3. **Eventos (O Ritmo do Coração):**</w:t>
+        <w:t>3. **Os Eventos (Inspeção e Adaptação):**</w:t>
       </w:r>
     </w:p>
     <w:p>
       <w:r>
-        <w:t>- **Sprint:** O container para todos os outros eventos, com duração fixa (geralmente 1 a 4 semanas).</w:t>
+        <w:t>- **Sprint Planning:** Onde o 'Como' e o 'O Quê' são definidos.</w:t>
       </w:r>
     </w:p>
     <w:p>
       <w:r>
-        <w:t>- **Sprint Planning:** Define o 'O quê' (objetivo) e o 'Como' (plano).</w:t>
+        <w:t>- **Daily Scrum:** O ciclo de feedback de 24 horas para alinhar o time.</w:t>
       </w:r>
     </w:p>
     <w:p>
       <w:r>
-        <w:t>- **Daily Scrum:** Evento de 15 minutos para os desenvolvedores sincronizarem e adaptarem o plano das próximas 24 horas.</w:t>
+        <w:t>- **Sprint Review:** Inspeção do incremento com Stakeholders.</w:t>
       </w:r>
     </w:p>
     <w:p>
       <w:r>
-        <w:t>- **Sprint Review:** Inspeção do incremento e adaptação do Product Backlog com stakeholders.</w:t>
-      </w:r>
-    </w:p>
-    <w:p>
-      <w:r>
-        <w:t>- **Sprint Retrospective:** Foco em pessoas, relacionamentos, processos e ferramentas para melhoria contínua.</w:t>
+        <w:t>- **Sprint Retrospective:** Foco na melhoria do processo e das pessoas (representada pelo ícone de ajuste de engrenagens).</w:t>
       </w:r>
     </w:p>
     <w:p>
@@ -140,77 +143,62 @@
     </w:p>
     <w:p>
       <w:r>
-        <w:t>A visualização de um fluxo Scrum pode ser descrita via lógica de estados. Imagine um sistema de gestão de tarefas (Jira/Azure DevOps) operando sob a seguinte lógica de fluxo:</w:t>
+        <w:t>Embora o Scrum seja um framework de gestão, ele se traduz em ferramentas de engenharia. Um exemplo clássico é a automação do fluxo de trabalho em ferramentas como Jira ou GitHub Projects via CLI ou automações:</w:t>
       </w:r>
     </w:p>
     <w:p>
       <w:r>
-        <w:t>text</w:t>
+        <w:t>bash</w:t>
       </w:r>
     </w:p>
     <w:p>
       <w:r>
-        <w:t>[BACKLOG GERAL] -&gt; (Refinement) -&gt; [SPRINT BACKLOG]</w:t>
+        <w:t># Exemplo de fluxo de automação para mover cards no Sprint Backlog</w:t>
       </w:r>
     </w:p>
     <w:p>
       <w:r>
-        <w:t>|</w:t>
+        <w:t># Usando GitHub CLI (gh) para simular a transição de um item do Backlog</w:t>
       </w:r>
     </w:p>
     <w:p>
       <w:r>
-        <w:t>v</w:t>
+        <w:t># 1. Listar itens no status 'To Do'</w:t>
       </w:r>
     </w:p>
     <w:p>
       <w:r>
-        <w:t>[TODO] -&gt; [IN PROGRESS] -&gt; [TESTING] -&gt; [DONE (DoD)]</w:t>
+        <w:t>gh project item-list 1 --owner "@meu-time" --format json</w:t>
       </w:r>
     </w:p>
     <w:p>
       <w:r>
-        <w:t>|</w:t>
+        <w:t># 2. Mover item para 'Doing' ao iniciar a branch de desenvolvimento</w:t>
       </w:r>
     </w:p>
     <w:p>
       <w:r>
-        <w:t>v</w:t>
+        <w:t>git checkout -b feature/refactor-api-v1</w:t>
       </w:r>
     </w:p>
     <w:p>
       <w:r>
-        <w:t>[INCREMENTO POTENCIALMENTE RELEASÁVEL]</w:t>
+        <w:t>gh project item-edit 1 --id "ITEM_ID" --field "Status" --value "Doing"</w:t>
       </w:r>
     </w:p>
     <w:p>
       <w:r>
-        <w:t>Exemplo de estrutura de uma 'User Story' técnica para o laboratório:</w:t>
+        <w:t># 3. Marcar como 'Done' após o Merge Request aprovado</w:t>
       </w:r>
     </w:p>
     <w:p>
       <w:r>
-        <w:t>- **Título:** Autenticação via OAuth2.</w:t>
+        <w:t>gh project item-edit 1 --id "ITEM_ID" --field "Status" --value "Done"</w:t>
       </w:r>
     </w:p>
     <w:p>
       <w:r>
-        <w:t>- **Como** Usuário final,</w:t>
-      </w:r>
-    </w:p>
-    <w:p>
-      <w:r>
-        <w:t>- **Eu quero** me autenticar usando minha conta Google,</w:t>
-      </w:r>
-    </w:p>
-    <w:p>
-      <w:r>
-        <w:t>- **Para que** eu não precise memorizar uma nova senha.</w:t>
-      </w:r>
-    </w:p>
-    <w:p>
-      <w:r>
-        <w:t>- **Critérios de Aceite (DoD):** Token JWT retornado com sucesso; Log de auditoria gerado; Erro 401 tratado para logins inválidos.</w:t>
+        <w:t>O fluxogama operacional segue a lógica: `Input (Stakeholders/Ideias) -&gt; Filter (Refinement) -&gt; Queue (Backlog) -&gt; Cycle (Sprint) -&gt; Output (Increment) -&gt; Feedback (Review/Retro)`.</w:t>
       </w:r>
     </w:p>
     <w:p>
@@ -220,12 +208,27 @@
     </w:p>
     <w:p>
       <w:r>
-        <w:t>O que a maioria falha em entender é que o Scrum não é uma metodologia de 'fazer mais rápido', mas sim de 'errar mais cedo'. O erro mais comum em exames de certificação (como PSM I) e no dia a dia é a confusão entre o Scrum Master e um Gerente de Projetos tradicional. O SM não 'manda' no time; ele empodera o time para que este se autogerencie.</w:t>
+        <w:t>O que a maioria dos profissionais ignora é que o Scrum não é um processo de 'entrega rápida', mas de 'descoberta rápida'.</w:t>
       </w:r>
     </w:p>
     <w:p>
       <w:r>
-        <w:t>Outro ponto nevrálgico: a 'Velocidade' do time. No mercado, gestores tóxicos usam a velocidade para comparar times. Isso é um erro técnico crasso. Velocidade é uma métrica interna de capacidade, não de produtividade comparativa. Se você aumenta a pressão pela velocidade, o time sacrifica a qualidade (Dívida Técnica), o que viola o pilar da Transparência, pois o 'Done' deixa de ser verdadeiramente 'Done'. O verdadeiro domínio do Scrum exige entender que o framework é propositalmente incompleto; ele apenas expõe as ineficiências da sua organização para que você possa resolvê-las.</w:t>
+        <w:t>- **A Armadilha do Daily Scrum:** Muitos o transformam em um 'status report' para o gestor. Errado. O Daily é para o Time de Desenvolvimento sincronizar entre si.</w:t>
+      </w:r>
+    </w:p>
+    <w:p>
+      <w:r>
+        <w:t>- **O 'Shadow' Scrum Master:** Em muitas empresas, o Scrum Master acaba agindo como um Secretário de Luxo ou um Project Manager disfarçado. Isso mata a auto-organização do time.</w:t>
+      </w:r>
+    </w:p>
+    <w:p>
+      <w:r>
+        <w:t>- **Dívida Técnica:** O diagrama mostra o 'Incremento do Produto' como algo pronto. No entanto, se a 'Definição de Pronto' não incluir testes automatizados e refatoração, o time está apenas criando uma 'bola de lama' técnica que explodirá em Sprints futuros.</w:t>
+      </w:r>
+    </w:p>
+    <w:p>
+      <w:r>
+        <w:t>- **Insight de Prova:** Lembre-se, o Scrum não dita 'como' desenvolver (não impõe TDD ou Pair Programming), ele fornece o 'framework' de gestão dentro do qual as práticas de engenharia devem ser adaptadas.</w:t>
       </w:r>
     </w:p>
     <w:sectPr>

</xml_diff>